<commit_message>
Add team names and roll numbers to report
Co-Authored-By: Claude Sonnet 5.5 <noreply@anthropic.com>
Claude-Session: https://claude.ai/code/session_01SWoaAp7q8y4S8UdG5ePDXy
</commit_message>
<xml_diff>
--- a/docs/Mini_Project_Report_Pawred.docx
+++ b/docs/Mini_Project_Report_Pawred.docx
@@ -34,7 +34,7 @@
     <w:p>
       <w:pPr/>
       <w:r>
-        <w:t xml:space="preserve">Mini Project (DJS23AMD302L) · Submitted by [Student Name(s), Roll No.] · Guided by [Guide Name] · [Department], [College Name] · Academic Year 2026–27</w:t>
+        <w:t xml:space="preserve">Mini Project (DJS23AMD302L) · Submitted by Adish Shah (A110), Manya Sanghvi (A133), Kavya Shah (A114), Juee Shimpi (A118) · Guided by [Guide Name] · [Department], [College Name] · Academic Year 2026–27</w:t>
       </w:r>
     </w:p>
     <w:p>
@@ -822,7 +822,7 @@
     <w:p>
       <w:pPr/>
       <w:r>
-        <w:t xml:space="preserve">[Student Name, Roll No., Signature] · Date: ____________</w:t>
+        <w:t xml:space="preserve">Adish Shah (A110), Manya Sanghvi (A133), Kavya Shah (A114), Juee Shimpi (A118) · Signature: ____________ · Date: ____________</w:t>
       </w:r>
     </w:p>
     <w:p>

</xml_diff>

<commit_message>
Update report: weekly implementation section and app screenshots
Co-Authored-By: Claude Sonnet 5.5 <noreply@anthropic.com>
Claude-Session: https://claude.ai/code/session_01SWoaAp7q8y4S8UdG5ePDXy
</commit_message>
<xml_diff>
--- a/docs/Mini_Project_Report_Pawred.docx
+++ b/docs/Mini_Project_Report_Pawred.docx
@@ -588,7 +588,7 @@
           <w:p>
             <w:pPr/>
             <w:r>
-              <w:t xml:space="preserve">System Architecture</w:t>
+              <w:t xml:space="preserve">Weekly Implementation of Tasks</w:t>
             </w:r>
           </w:p>
         </w:tc>
@@ -893,9 +893,9 @@
         <w:tblLook w:val="04A0" w:firstRow="1" w:lastRow="0" w:firstColumn="0" w:lastColumn="0" w:noHBand="0" w:noVBand="1"/>
       </w:tblPr>
       <w:tblGrid>
-        <w:gridCol w:w="1466"/>
-        <w:gridCol w:w="6530"/>
-        <w:gridCol w:w="1363"/>
+        <w:gridCol w:w="1838"/>
+        <w:gridCol w:w="5813"/>
+        <w:gridCol w:w="1708"/>
       </w:tblGrid>
       <w:tr>
         <w:trPr>
@@ -903,7 +903,7 @@
         </w:trPr>
         <w:tc>
           <w:tcPr>
-            <w:tcW w:w="1466" w:type="dxa"/>
+            <w:tcW w:w="1838" w:type="dxa"/>
             <w:shd w:val="clear" w:color="auto" w:fill="F2F2F2"/>
           </w:tcPr>
           <w:p>
@@ -915,7 +915,7 @@
         </w:tc>
         <w:tc>
           <w:tcPr>
-            <w:tcW w:w="6530" w:type="dxa"/>
+            <w:tcW w:w="5813" w:type="dxa"/>
             <w:shd w:val="clear" w:color="auto" w:fill="F2F2F2"/>
           </w:tcPr>
           <w:p>
@@ -927,7 +927,7 @@
         </w:tc>
         <w:tc>
           <w:tcPr>
-            <w:tcW w:w="1363" w:type="dxa"/>
+            <w:tcW w:w="1708" w:type="dxa"/>
             <w:shd w:val="clear" w:color="auto" w:fill="F2F2F2"/>
           </w:tcPr>
           <w:p>
@@ -941,7 +941,7 @@
       <w:tr>
         <w:tc>
           <w:tcPr>
-            <w:tcW w:w="1466" w:type="dxa"/>
+            <w:tcW w:w="1838" w:type="dxa"/>
           </w:tcPr>
           <w:p>
             <w:pPr/>
@@ -952,7 +952,7 @@
         </w:tc>
         <w:tc>
           <w:tcPr>
-            <w:tcW w:w="6530" w:type="dxa"/>
+            <w:tcW w:w="5813" w:type="dxa"/>
           </w:tcPr>
           <w:p>
             <w:pPr/>
@@ -963,7 +963,7 @@
         </w:tc>
         <w:tc>
           <w:tcPr>
-            <w:tcW w:w="1363" w:type="dxa"/>
+            <w:tcW w:w="1708" w:type="dxa"/>
           </w:tcPr>
           <w:p>
             <w:pPr/>
@@ -976,29 +976,29 @@
       <w:tr>
         <w:tc>
           <w:tcPr>
-            <w:tcW w:w="1466" w:type="dxa"/>
-          </w:tcPr>
-          <w:p>
-            <w:pPr/>
-            <w:r>
-              <w:t xml:space="preserve">3.2</w:t>
-            </w:r>
-          </w:p>
-        </w:tc>
-        <w:tc>
-          <w:tcPr>
-            <w:tcW w:w="6530" w:type="dxa"/>
-          </w:tcPr>
-          <w:p>
-            <w:pPr/>
-            <w:r>
-              <w:t xml:space="preserve">Match screen after a mutual like [insert screenshot]</w:t>
-            </w:r>
-          </w:p>
-        </w:tc>
-        <w:tc>
-          <w:tcPr>
-            <w:tcW w:w="1363" w:type="dxa"/>
+            <w:tcW w:w="1838" w:type="dxa"/>
+          </w:tcPr>
+          <w:p>
+            <w:pPr/>
+            <w:r>
+              <w:t xml:space="preserve">4.1</w:t>
+            </w:r>
+          </w:p>
+        </w:tc>
+        <w:tc>
+          <w:tcPr>
+            <w:tcW w:w="5813" w:type="dxa"/>
+          </w:tcPr>
+          <w:p>
+            <w:pPr/>
+            <w:r>
+              <w:t xml:space="preserve">Landing page</w:t>
+            </w:r>
+          </w:p>
+        </w:tc>
+        <w:tc>
+          <w:tcPr>
+            <w:tcW w:w="1708" w:type="dxa"/>
           </w:tcPr>
           <w:p>
             <w:pPr/>
@@ -1011,29 +1011,29 @@
       <w:tr>
         <w:tc>
           <w:tcPr>
-            <w:tcW w:w="1466" w:type="dxa"/>
-          </w:tcPr>
-          <w:p>
-            <w:pPr/>
-            <w:r>
-              <w:t xml:space="preserve">4.1</w:t>
-            </w:r>
-          </w:p>
-        </w:tc>
-        <w:tc>
-          <w:tcPr>
-            <w:tcW w:w="6530" w:type="dxa"/>
-          </w:tcPr>
-          <w:p>
-            <w:pPr/>
-            <w:r>
-              <w:t xml:space="preserve">Discover feed with fit notes [insert screenshot]</w:t>
-            </w:r>
-          </w:p>
-        </w:tc>
-        <w:tc>
-          <w:tcPr>
-            <w:tcW w:w="1363" w:type="dxa"/>
+            <w:tcW w:w="1838" w:type="dxa"/>
+          </w:tcPr>
+          <w:p>
+            <w:pPr/>
+            <w:r>
+              <w:t xml:space="preserve">4.2</w:t>
+            </w:r>
+          </w:p>
+        </w:tc>
+        <w:tc>
+          <w:tcPr>
+            <w:tcW w:w="5813" w:type="dxa"/>
+          </w:tcPr>
+          <w:p>
+            <w:pPr/>
+            <w:r>
+              <w:t xml:space="preserve">How it works page</w:t>
+            </w:r>
+          </w:p>
+        </w:tc>
+        <w:tc>
+          <w:tcPr>
+            <w:tcW w:w="1708" w:type="dxa"/>
           </w:tcPr>
           <w:p>
             <w:pPr/>
@@ -1046,29 +1046,29 @@
       <w:tr>
         <w:tc>
           <w:tcPr>
-            <w:tcW w:w="1466" w:type="dxa"/>
-          </w:tcPr>
-          <w:p>
-            <w:pPr/>
-            <w:r>
-              <w:t xml:space="preserve">4.2</w:t>
-            </w:r>
-          </w:p>
-        </w:tc>
-        <w:tc>
-          <w:tcPr>
-            <w:tcW w:w="6530" w:type="dxa"/>
-          </w:tcPr>
-          <w:p>
-            <w:pPr/>
-            <w:r>
-              <w:t xml:space="preserve">Likes-you screen [insert screenshot]</w:t>
-            </w:r>
-          </w:p>
-        </w:tc>
-        <w:tc>
-          <w:tcPr>
-            <w:tcW w:w="1363" w:type="dxa"/>
+            <w:tcW w:w="1838" w:type="dxa"/>
+          </w:tcPr>
+          <w:p>
+            <w:pPr/>
+            <w:r>
+              <w:t xml:space="preserve">4.3</w:t>
+            </w:r>
+          </w:p>
+        </w:tc>
+        <w:tc>
+          <w:tcPr>
+            <w:tcW w:w="5813" w:type="dxa"/>
+          </w:tcPr>
+          <w:p>
+            <w:pPr/>
+            <w:r>
+              <w:t xml:space="preserve">Safety page and breed guide</w:t>
+            </w:r>
+          </w:p>
+        </w:tc>
+        <w:tc>
+          <w:tcPr>
+            <w:tcW w:w="1708" w:type="dxa"/>
           </w:tcPr>
           <w:p>
             <w:pPr/>
@@ -1081,29 +1081,29 @@
       <w:tr>
         <w:tc>
           <w:tcPr>
-            <w:tcW w:w="1466" w:type="dxa"/>
-          </w:tcPr>
-          <w:p>
-            <w:pPr/>
-            <w:r>
-              <w:t xml:space="preserve">4.3</w:t>
-            </w:r>
-          </w:p>
-        </w:tc>
-        <w:tc>
-          <w:tcPr>
-            <w:tcW w:w="6530" w:type="dxa"/>
-          </w:tcPr>
-          <w:p>
-            <w:pPr/>
-            <w:r>
-              <w:t xml:space="preserve">Chat thread between matched owners [insert screenshot]</w:t>
-            </w:r>
-          </w:p>
-        </w:tc>
-        <w:tc>
-          <w:tcPr>
-            <w:tcW w:w="1363" w:type="dxa"/>
+            <w:tcW w:w="1838" w:type="dxa"/>
+          </w:tcPr>
+          <w:p>
+            <w:pPr/>
+            <w:r>
+              <w:t xml:space="preserve">4.4</w:t>
+            </w:r>
+          </w:p>
+        </w:tc>
+        <w:tc>
+          <w:tcPr>
+            <w:tcW w:w="5813" w:type="dxa"/>
+          </w:tcPr>
+          <w:p>
+            <w:pPr/>
+            <w:r>
+              <w:t xml:space="preserve">Sign-in and sign-up pages</w:t>
+            </w:r>
+          </w:p>
+        </w:tc>
+        <w:tc>
+          <w:tcPr>
+            <w:tcW w:w="1708" w:type="dxa"/>
           </w:tcPr>
           <w:p>
             <w:pPr/>
@@ -1116,29 +1116,414 @@
       <w:tr>
         <w:tc>
           <w:tcPr>
-            <w:tcW w:w="1466" w:type="dxa"/>
-          </w:tcPr>
-          <w:p>
-            <w:pPr/>
-            <w:r>
-              <w:t xml:space="preserve">4.4</w:t>
-            </w:r>
-          </w:p>
-        </w:tc>
-        <w:tc>
-          <w:tcPr>
-            <w:tcW w:w="6530" w:type="dxa"/>
-          </w:tcPr>
-          <w:p>
-            <w:pPr/>
-            <w:r>
-              <w:t xml:space="preserve">Admin verification queue [insert screenshot]</w:t>
-            </w:r>
-          </w:p>
-        </w:tc>
-        <w:tc>
-          <w:tcPr>
-            <w:tcW w:w="1363" w:type="dxa"/>
+            <w:tcW w:w="1838" w:type="dxa"/>
+          </w:tcPr>
+          <w:p>
+            <w:pPr/>
+            <w:r>
+              <w:t xml:space="preserve">4.5</w:t>
+            </w:r>
+          </w:p>
+        </w:tc>
+        <w:tc>
+          <w:tcPr>
+            <w:tcW w:w="5813" w:type="dxa"/>
+          </w:tcPr>
+          <w:p>
+            <w:pPr/>
+            <w:r>
+              <w:t xml:space="preserve">Onboarding</w:t>
+            </w:r>
+          </w:p>
+        </w:tc>
+        <w:tc>
+          <w:tcPr>
+            <w:tcW w:w="1708" w:type="dxa"/>
+          </w:tcPr>
+          <w:p>
+            <w:pPr/>
+            <w:r>
+              <w:t xml:space="preserve">4</w:t>
+            </w:r>
+          </w:p>
+        </w:tc>
+      </w:tr>
+      <w:tr>
+        <w:tc>
+          <w:tcPr>
+            <w:tcW w:w="1838" w:type="dxa"/>
+          </w:tcPr>
+          <w:p>
+            <w:pPr/>
+            <w:r>
+              <w:t xml:space="preserve">4.6</w:t>
+            </w:r>
+          </w:p>
+        </w:tc>
+        <w:tc>
+          <w:tcPr>
+            <w:tcW w:w="5813" w:type="dxa"/>
+          </w:tcPr>
+          <w:p>
+            <w:pPr/>
+            <w:r>
+              <w:t xml:space="preserve">Discover, Feed view</w:t>
+            </w:r>
+          </w:p>
+        </w:tc>
+        <w:tc>
+          <w:tcPr>
+            <w:tcW w:w="1708" w:type="dxa"/>
+          </w:tcPr>
+          <w:p>
+            <w:pPr/>
+            <w:r>
+              <w:t xml:space="preserve">4</w:t>
+            </w:r>
+          </w:p>
+        </w:tc>
+      </w:tr>
+      <w:tr>
+        <w:tc>
+          <w:tcPr>
+            <w:tcW w:w="1838" w:type="dxa"/>
+          </w:tcPr>
+          <w:p>
+            <w:pPr/>
+            <w:r>
+              <w:t xml:space="preserve">4.7</w:t>
+            </w:r>
+          </w:p>
+        </w:tc>
+        <w:tc>
+          <w:tcPr>
+            <w:tcW w:w="5813" w:type="dxa"/>
+          </w:tcPr>
+          <w:p>
+            <w:pPr/>
+            <w:r>
+              <w:t xml:space="preserve">Discover, Grid view</w:t>
+            </w:r>
+          </w:p>
+        </w:tc>
+        <w:tc>
+          <w:tcPr>
+            <w:tcW w:w="1708" w:type="dxa"/>
+          </w:tcPr>
+          <w:p>
+            <w:pPr/>
+            <w:r>
+              <w:t xml:space="preserve">4</w:t>
+            </w:r>
+          </w:p>
+        </w:tc>
+      </w:tr>
+      <w:tr>
+        <w:tc>
+          <w:tcPr>
+            <w:tcW w:w="1838" w:type="dxa"/>
+          </w:tcPr>
+          <w:p>
+            <w:pPr/>
+            <w:r>
+              <w:t xml:space="preserve">4.8</w:t>
+            </w:r>
+          </w:p>
+        </w:tc>
+        <w:tc>
+          <w:tcPr>
+            <w:tcW w:w="5813" w:type="dxa"/>
+          </w:tcPr>
+          <w:p>
+            <w:pPr/>
+            <w:r>
+              <w:t xml:space="preserve">Discover on a phone</w:t>
+            </w:r>
+          </w:p>
+        </w:tc>
+        <w:tc>
+          <w:tcPr>
+            <w:tcW w:w="1708" w:type="dxa"/>
+          </w:tcPr>
+          <w:p>
+            <w:pPr/>
+            <w:r>
+              <w:t xml:space="preserve">4</w:t>
+            </w:r>
+          </w:p>
+        </w:tc>
+      </w:tr>
+      <w:tr>
+        <w:tc>
+          <w:tcPr>
+            <w:tcW w:w="1838" w:type="dxa"/>
+          </w:tcPr>
+          <w:p>
+            <w:pPr/>
+            <w:r>
+              <w:t xml:space="preserve">4.9</w:t>
+            </w:r>
+          </w:p>
+        </w:tc>
+        <w:tc>
+          <w:tcPr>
+            <w:tcW w:w="5813" w:type="dxa"/>
+          </w:tcPr>
+          <w:p>
+            <w:pPr/>
+            <w:r>
+              <w:t xml:space="preserve">Dog profile</w:t>
+            </w:r>
+          </w:p>
+        </w:tc>
+        <w:tc>
+          <w:tcPr>
+            <w:tcW w:w="1708" w:type="dxa"/>
+          </w:tcPr>
+          <w:p>
+            <w:pPr/>
+            <w:r>
+              <w:t xml:space="preserve">4</w:t>
+            </w:r>
+          </w:p>
+        </w:tc>
+      </w:tr>
+      <w:tr>
+        <w:tc>
+          <w:tcPr>
+            <w:tcW w:w="1838" w:type="dxa"/>
+          </w:tcPr>
+          <w:p>
+            <w:pPr/>
+            <w:r>
+              <w:t xml:space="preserve">4.10</w:t>
+            </w:r>
+          </w:p>
+        </w:tc>
+        <w:tc>
+          <w:tcPr>
+            <w:tcW w:w="5813" w:type="dxa"/>
+          </w:tcPr>
+          <w:p>
+            <w:pPr/>
+            <w:r>
+              <w:t xml:space="preserve">Edit dog profile</w:t>
+            </w:r>
+          </w:p>
+        </w:tc>
+        <w:tc>
+          <w:tcPr>
+            <w:tcW w:w="1708" w:type="dxa"/>
+          </w:tcPr>
+          <w:p>
+            <w:pPr/>
+            <w:r>
+              <w:t xml:space="preserve">4</w:t>
+            </w:r>
+          </w:p>
+        </w:tc>
+      </w:tr>
+      <w:tr>
+        <w:tc>
+          <w:tcPr>
+            <w:tcW w:w="1838" w:type="dxa"/>
+          </w:tcPr>
+          <w:p>
+            <w:pPr/>
+            <w:r>
+              <w:t xml:space="preserve">4.11</w:t>
+            </w:r>
+          </w:p>
+        </w:tc>
+        <w:tc>
+          <w:tcPr>
+            <w:tcW w:w="5813" w:type="dxa"/>
+          </w:tcPr>
+          <w:p>
+            <w:pPr/>
+            <w:r>
+              <w:t xml:space="preserve">Settings</w:t>
+            </w:r>
+          </w:p>
+        </w:tc>
+        <w:tc>
+          <w:tcPr>
+            <w:tcW w:w="1708" w:type="dxa"/>
+          </w:tcPr>
+          <w:p>
+            <w:pPr/>
+            <w:r>
+              <w:t xml:space="preserve">4</w:t>
+            </w:r>
+          </w:p>
+        </w:tc>
+      </w:tr>
+      <w:tr>
+        <w:tc>
+          <w:tcPr>
+            <w:tcW w:w="1838" w:type="dxa"/>
+          </w:tcPr>
+          <w:p>
+            <w:pPr/>
+            <w:r>
+              <w:t xml:space="preserve">4.12</w:t>
+            </w:r>
+          </w:p>
+        </w:tc>
+        <w:tc>
+          <w:tcPr>
+            <w:tcW w:w="5813" w:type="dxa"/>
+          </w:tcPr>
+          <w:p>
+            <w:pPr/>
+            <w:r>
+              <w:t xml:space="preserve">Likes you and matches</w:t>
+            </w:r>
+          </w:p>
+        </w:tc>
+        <w:tc>
+          <w:tcPr>
+            <w:tcW w:w="1708" w:type="dxa"/>
+          </w:tcPr>
+          <w:p>
+            <w:pPr/>
+            <w:r>
+              <w:t xml:space="preserve">4</w:t>
+            </w:r>
+          </w:p>
+        </w:tc>
+      </w:tr>
+      <w:tr>
+        <w:tc>
+          <w:tcPr>
+            <w:tcW w:w="1838" w:type="dxa"/>
+          </w:tcPr>
+          <w:p>
+            <w:pPr/>
+            <w:r>
+              <w:t xml:space="preserve">4.13</w:t>
+            </w:r>
+          </w:p>
+        </w:tc>
+        <w:tc>
+          <w:tcPr>
+            <w:tcW w:w="5813" w:type="dxa"/>
+          </w:tcPr>
+          <w:p>
+            <w:pPr/>
+            <w:r>
+              <w:t xml:space="preserve">Chat</w:t>
+            </w:r>
+          </w:p>
+        </w:tc>
+        <w:tc>
+          <w:tcPr>
+            <w:tcW w:w="1708" w:type="dxa"/>
+          </w:tcPr>
+          <w:p>
+            <w:pPr/>
+            <w:r>
+              <w:t xml:space="preserve">4</w:t>
+            </w:r>
+          </w:p>
+        </w:tc>
+      </w:tr>
+      <w:tr>
+        <w:tc>
+          <w:tcPr>
+            <w:tcW w:w="1838" w:type="dxa"/>
+          </w:tcPr>
+          <w:p>
+            <w:pPr/>
+            <w:r>
+              <w:t xml:space="preserve">4.14</w:t>
+            </w:r>
+          </w:p>
+        </w:tc>
+        <w:tc>
+          <w:tcPr>
+            <w:tcW w:w="5813" w:type="dxa"/>
+          </w:tcPr>
+          <w:p>
+            <w:pPr/>
+            <w:r>
+              <w:t xml:space="preserve">Admin overview</w:t>
+            </w:r>
+          </w:p>
+        </w:tc>
+        <w:tc>
+          <w:tcPr>
+            <w:tcW w:w="1708" w:type="dxa"/>
+          </w:tcPr>
+          <w:p>
+            <w:pPr/>
+            <w:r>
+              <w:t xml:space="preserve">4</w:t>
+            </w:r>
+          </w:p>
+        </w:tc>
+      </w:tr>
+      <w:tr>
+        <w:tc>
+          <w:tcPr>
+            <w:tcW w:w="1838" w:type="dxa"/>
+          </w:tcPr>
+          <w:p>
+            <w:pPr/>
+            <w:r>
+              <w:t xml:space="preserve">4.15</w:t>
+            </w:r>
+          </w:p>
+        </w:tc>
+        <w:tc>
+          <w:tcPr>
+            <w:tcW w:w="5813" w:type="dxa"/>
+          </w:tcPr>
+          <w:p>
+            <w:pPr/>
+            <w:r>
+              <w:t xml:space="preserve">Admin verifications</w:t>
+            </w:r>
+          </w:p>
+        </w:tc>
+        <w:tc>
+          <w:tcPr>
+            <w:tcW w:w="1708" w:type="dxa"/>
+          </w:tcPr>
+          <w:p>
+            <w:pPr/>
+            <w:r>
+              <w:t xml:space="preserve">4</w:t>
+            </w:r>
+          </w:p>
+        </w:tc>
+      </w:tr>
+      <w:tr>
+        <w:tc>
+          <w:tcPr>
+            <w:tcW w:w="1838" w:type="dxa"/>
+          </w:tcPr>
+          <w:p>
+            <w:pPr/>
+            <w:r>
+              <w:t xml:space="preserve">4.16</w:t>
+            </w:r>
+          </w:p>
+        </w:tc>
+        <w:tc>
+          <w:tcPr>
+            <w:tcW w:w="5813" w:type="dxa"/>
+          </w:tcPr>
+          <w:p>
+            <w:pPr/>
+            <w:r>
+              <w:t xml:space="preserve">Admin reports and users</w:t>
+            </w:r>
+          </w:p>
+        </w:tc>
+        <w:tc>
+          <w:tcPr>
+            <w:tcW w:w="1708" w:type="dxa"/>
           </w:tcPr>
           <w:p>
             <w:pPr/>
@@ -1299,6 +1684,41 @@
           <w:p>
             <w:pPr/>
             <w:r>
+              <w:t xml:space="preserve">Weekly implementation plan</w:t>
+            </w:r>
+          </w:p>
+        </w:tc>
+        <w:tc>
+          <w:tcPr>
+            <w:tcW w:w="1333" w:type="dxa"/>
+          </w:tcPr>
+          <w:p>
+            <w:pPr/>
+            <w:r>
+              <w:t xml:space="preserve">3</w:t>
+            </w:r>
+          </w:p>
+        </w:tc>
+      </w:tr>
+      <w:tr>
+        <w:tc>
+          <w:tcPr>
+            <w:tcW w:w="1640" w:type="dxa"/>
+          </w:tcPr>
+          <w:p>
+            <w:pPr/>
+            <w:r>
+              <w:t xml:space="preserve">3.2</w:t>
+            </w:r>
+          </w:p>
+        </w:tc>
+        <w:tc>
+          <w:tcPr>
+            <w:tcW w:w="6386" w:type="dxa"/>
+          </w:tcPr>
+          <w:p>
+            <w:pPr/>
+            <w:r>
               <w:t xml:space="preserve">Technology stack</w:t>
             </w:r>
           </w:p>
@@ -1323,7 +1743,7 @@
           <w:p>
             <w:pPr/>
             <w:r>
-              <w:t xml:space="preserve">3.2</w:t>
+              <w:t xml:space="preserve">3.3</w:t>
             </w:r>
           </w:p>
         </w:tc>
@@ -2643,7 +3063,376 @@
         <w:pStyle w:val="Heading3"/>
       </w:pPr>
       <w:r>
-        <w:t xml:space="preserve">3.1 System Architecture</w:t>
+        <w:t xml:space="preserve">3.1 Weekly Implementation of Tasks</w:t>
+      </w:r>
+    </w:p>
+    <w:p>
+      <w:pPr/>
+      <w:r>
+        <w:t xml:space="preserve">The project was carried out over eight weeks by a team of four. Table 3.1 lists the work completed in each week. [Adjust the weeks and tasks to match your actual schedule.]</w:t>
+      </w:r>
+    </w:p>
+    <w:p>
+      <w:pPr/>
+      <w:r>
+        <w:rPr>
+          <w:b/>
+        </w:rPr>
+        <w:t xml:space="preserve">Table 3.1 — Weekly implementation plan</w:t>
+      </w:r>
+    </w:p>
+    <w:tbl>
+      <w:tblPr>
+        <w:tblStyle w:val="TableGrid"/>
+        <w:tblW w:w="0" w:type="auto"/>
+        <w:tblLayout w:type="fixed"/>
+        <w:tblLook w:val="04A0" w:firstRow="1" w:lastRow="0" w:firstColumn="0" w:lastColumn="0" w:noHBand="0" w:noVBand="1"/>
+      </w:tblPr>
+      <w:tblGrid>
+        <w:gridCol w:w="797"/>
+        <w:gridCol w:w="4920"/>
+        <w:gridCol w:w="3643"/>
+      </w:tblGrid>
+      <w:tr>
+        <w:trPr>
+          <w:tblHeader/>
+        </w:trPr>
+        <w:tc>
+          <w:tcPr>
+            <w:tcW w:w="797" w:type="dxa"/>
+            <w:shd w:val="clear" w:color="auto" w:fill="F2F2F2"/>
+          </w:tcPr>
+          <w:p>
+            <w:pPr/>
+            <w:r>
+              <w:t xml:space="preserve">Week</w:t>
+            </w:r>
+          </w:p>
+        </w:tc>
+        <w:tc>
+          <w:tcPr>
+            <w:tcW w:w="4920" w:type="dxa"/>
+            <w:shd w:val="clear" w:color="auto" w:fill="F2F2F2"/>
+          </w:tcPr>
+          <w:p>
+            <w:pPr/>
+            <w:r>
+              <w:t xml:space="preserve">Tasks completed</w:t>
+            </w:r>
+          </w:p>
+        </w:tc>
+        <w:tc>
+          <w:tcPr>
+            <w:tcW w:w="3643" w:type="dxa"/>
+            <w:shd w:val="clear" w:color="auto" w:fill="F2F2F2"/>
+          </w:tcPr>
+          <w:p>
+            <w:pPr/>
+            <w:r>
+              <w:t xml:space="preserve">Output</w:t>
+            </w:r>
+          </w:p>
+        </w:tc>
+      </w:tr>
+      <w:tr>
+        <w:tc>
+          <w:tcPr>
+            <w:tcW w:w="797" w:type="dxa"/>
+          </w:tcPr>
+          <w:p>
+            <w:pPr/>
+            <w:r>
+              <w:t xml:space="preserve">1</w:t>
+            </w:r>
+          </w:p>
+        </w:tc>
+        <w:tc>
+          <w:tcPr>
+            <w:tcW w:w="4920" w:type="dxa"/>
+          </w:tcPr>
+          <w:p>
+            <w:pPr/>
+            <w:r>
+              <w:t xml:space="preserve">Chose the problem, studied how owners find breeding partners today, and listed the matching rules (opposite sex, same breed, 18 months or older)</w:t>
+            </w:r>
+          </w:p>
+        </w:tc>
+        <w:tc>
+          <w:tcPr>
+            <w:tcW w:w="3643" w:type="dxa"/>
+          </w:tcPr>
+          <w:p>
+            <w:pPr/>
+            <w:r>
+              <w:t xml:space="preserve">Problem statement and requirements</w:t>
+            </w:r>
+          </w:p>
+        </w:tc>
+      </w:tr>
+      <w:tr>
+        <w:tc>
+          <w:tcPr>
+            <w:tcW w:w="797" w:type="dxa"/>
+          </w:tcPr>
+          <w:p>
+            <w:pPr/>
+            <w:r>
+              <w:t xml:space="preserve">2</w:t>
+            </w:r>
+          </w:p>
+        </w:tc>
+        <w:tc>
+          <w:tcPr>
+            <w:tcW w:w="4920" w:type="dxa"/>
+          </w:tcPr>
+          <w:p>
+            <w:pPr/>
+            <w:r>
+              <w:t xml:space="preserve">Reviewed recommendation techniques; designed the database schema and the look of the app</w:t>
+            </w:r>
+          </w:p>
+        </w:tc>
+        <w:tc>
+          <w:tcPr>
+            <w:tcW w:w="3643" w:type="dxa"/>
+          </w:tcPr>
+          <w:p>
+            <w:pPr/>
+            <w:r>
+              <w:t xml:space="preserve">Literature review, ER design, UI direction</w:t>
+            </w:r>
+          </w:p>
+        </w:tc>
+      </w:tr>
+      <w:tr>
+        <w:tc>
+          <w:tcPr>
+            <w:tcW w:w="797" w:type="dxa"/>
+          </w:tcPr>
+          <w:p>
+            <w:pPr/>
+            <w:r>
+              <w:t xml:space="preserve">3</w:t>
+            </w:r>
+          </w:p>
+        </w:tc>
+        <w:tc>
+          <w:tcPr>
+            <w:tcW w:w="4920" w:type="dxa"/>
+          </w:tcPr>
+          <w:p>
+            <w:pPr/>
+            <w:r>
+              <w:t xml:space="preserve">Set up Next.js, Tailwind, Prisma and Supabase; wrote the first migrations; built sign-up, sign-in and roles with Better Auth</w:t>
+            </w:r>
+          </w:p>
+        </w:tc>
+        <w:tc>
+          <w:tcPr>
+            <w:tcW w:w="3643" w:type="dxa"/>
+          </w:tcPr>
+          <w:p>
+            <w:pPr/>
+            <w:r>
+              <w:t xml:space="preserve">Working authentication</w:t>
+            </w:r>
+          </w:p>
+        </w:tc>
+      </w:tr>
+      <w:tr>
+        <w:tc>
+          <w:tcPr>
+            <w:tcW w:w="797" w:type="dxa"/>
+          </w:tcPr>
+          <w:p>
+            <w:pPr/>
+            <w:r>
+              <w:t xml:space="preserve">4</w:t>
+            </w:r>
+          </w:p>
+        </w:tc>
+        <w:tc>
+          <w:tcPr>
+            <w:tcW w:w="4920" w:type="dxa"/>
+          </w:tcPr>
+          <w:p>
+            <w:pPr/>
+            <w:r>
+              <w:t xml:space="preserve">Built dog onboarding: basics, photos, prompt answers and health documents, with file upload to storage</w:t>
+            </w:r>
+          </w:p>
+        </w:tc>
+        <w:tc>
+          <w:tcPr>
+            <w:tcW w:w="3643" w:type="dxa"/>
+          </w:tcPr>
+          <w:p>
+            <w:pPr/>
+            <w:r>
+              <w:t xml:space="preserve">Dog profiles with health documents</w:t>
+            </w:r>
+          </w:p>
+        </w:tc>
+      </w:tr>
+      <w:tr>
+        <w:tc>
+          <w:tcPr>
+            <w:tcW w:w="797" w:type="dxa"/>
+          </w:tcPr>
+          <w:p>
+            <w:pPr/>
+            <w:r>
+              <w:t xml:space="preserve">5</w:t>
+            </w:r>
+          </w:p>
+        </w:tc>
+        <w:tc>
+          <w:tcPr>
+            <w:tcW w:w="4920" w:type="dxa"/>
+          </w:tcPr>
+          <w:p>
+            <w:pPr/>
+            <w:r>
+              <w:t xml:space="preserve">Built the matching engine (compatibility filter, ranking, fit notes) and the Discover feed and grid</w:t>
+            </w:r>
+          </w:p>
+        </w:tc>
+        <w:tc>
+          <w:tcPr>
+            <w:tcW w:w="3643" w:type="dxa"/>
+          </w:tcPr>
+          <w:p>
+            <w:pPr/>
+            <w:r>
+              <w:t xml:space="preserve">Discover page</w:t>
+            </w:r>
+          </w:p>
+        </w:tc>
+      </w:tr>
+      <w:tr>
+        <w:tc>
+          <w:tcPr>
+            <w:tcW w:w="797" w:type="dxa"/>
+          </w:tcPr>
+          <w:p>
+            <w:pPr/>
+            <w:r>
+              <w:t xml:space="preserve">6</w:t>
+            </w:r>
+          </w:p>
+        </w:tc>
+        <w:tc>
+          <w:tcPr>
+            <w:tcW w:w="4920" w:type="dxa"/>
+          </w:tcPr>
+          <w:p>
+            <w:pPr/>
+            <w:r>
+              <w:t xml:space="preserve">Built likes, passes, matches and chat with read receipts and unread badges</w:t>
+            </w:r>
+          </w:p>
+        </w:tc>
+        <w:tc>
+          <w:tcPr>
+            <w:tcW w:w="3643" w:type="dxa"/>
+          </w:tcPr>
+          <w:p>
+            <w:pPr/>
+            <w:r>
+              <w:t xml:space="preserve">Likes you, Matches and Chat pages</w:t>
+            </w:r>
+          </w:p>
+        </w:tc>
+      </w:tr>
+      <w:tr>
+        <w:tc>
+          <w:tcPr>
+            <w:tcW w:w="797" w:type="dxa"/>
+          </w:tcPr>
+          <w:p>
+            <w:pPr/>
+            <w:r>
+              <w:t xml:space="preserve">7</w:t>
+            </w:r>
+          </w:p>
+        </w:tc>
+        <w:tc>
+          <w:tcPr>
+            <w:tcW w:w="4920" w:type="dxa"/>
+          </w:tcPr>
+          <w:p>
+            <w:pPr/>
+            <w:r>
+              <w:t xml:space="preserve">Built the admin panel (verifications, reports, users, activity feed); enabled row-level security</w:t>
+            </w:r>
+          </w:p>
+        </w:tc>
+        <w:tc>
+          <w:tcPr>
+            <w:tcW w:w="3643" w:type="dxa"/>
+          </w:tcPr>
+          <w:p>
+            <w:pPr/>
+            <w:r>
+              <w:t xml:space="preserve">Admin panel</w:t>
+            </w:r>
+          </w:p>
+        </w:tc>
+      </w:tr>
+      <w:tr>
+        <w:tc>
+          <w:tcPr>
+            <w:tcW w:w="797" w:type="dxa"/>
+          </w:tcPr>
+          <w:p>
+            <w:pPr/>
+            <w:r>
+              <w:t xml:space="preserve">8</w:t>
+            </w:r>
+          </w:p>
+        </w:tc>
+        <w:tc>
+          <w:tcPr>
+            <w:tcW w:w="4920" w:type="dxa"/>
+          </w:tcPr>
+          <w:p>
+            <w:pPr/>
+            <w:r>
+              <w:t xml:space="preserve">Built the landing and information pages; seeded demo data; tested, fixed and deployed on Vercel; wrote this report</w:t>
+            </w:r>
+          </w:p>
+        </w:tc>
+        <w:tc>
+          <w:tcPr>
+            <w:tcW w:w="3643" w:type="dxa"/>
+          </w:tcPr>
+          <w:p>
+            <w:pPr/>
+            <w:r>
+              <w:t xml:space="preserve">Deployed app and report</w:t>
+            </w:r>
+          </w:p>
+        </w:tc>
+      </w:tr>
+    </w:tbl>
+    <w:p>
+      <w:pPr>
+        <w:pStyle w:val="Heading3"/>
+      </w:pPr>
+      <w:r>
+        <w:t xml:space="preserve">3.2 System Development &amp; Deployment</w:t>
+      </w:r>
+    </w:p>
+    <w:p>
+      <w:pPr/>
+      <w:r>
+        <w:rPr>
+          <w:b/>
+        </w:rPr>
+        <w:t xml:space="preserve">System architecture.</w:t>
+      </w:r>
+      <w:r>
+        <w:t xml:space="preserve"> Fig. 3.1 shows how the parts of Pawred fit together.</w:t>
       </w:r>
     </w:p>
     <w:p>
@@ -2700,7 +3489,7 @@
         <w:rPr>
           <w:b/>
         </w:rPr>
-        <w:t xml:space="preserve">Table 3.1 — Technology stack</w:t>
+        <w:t xml:space="preserve">Table 3.2 — Technology stack</w:t>
       </w:r>
     </w:p>
     <w:tbl>
@@ -3008,7 +3797,7 @@
         <w:rPr>
           <w:b/>
         </w:rPr>
-        <w:t xml:space="preserve">Table 3.2 — Database entities</w:t>
+        <w:t xml:space="preserve">Table 3.3 — Database entities</w:t>
       </w:r>
     </w:p>
     <w:tbl>
@@ -3341,14 +4130,6 @@
       </w:r>
     </w:p>
     <w:p>
-      <w:pPr>
-        <w:pStyle w:val="Heading3"/>
-      </w:pPr>
-      <w:r>
-        <w:t xml:space="preserve">3.2 System Development &amp; Deployment</w:t>
-      </w:r>
-    </w:p>
-    <w:p>
       <w:pPr/>
       <w:r>
         <w:rPr>
@@ -3431,7 +4212,781 @@
     <w:p>
       <w:pPr/>
       <w:r>
-        <w:t xml:space="preserve">[Insert Fig. 4.1–4.4 screenshots here: Discover feed with fit notes, Likes You, chat thread, admin verification queue.]</w:t>
+        <w:t xml:space="preserve">The screens below were captured from the running application. All owners, dogs, chats and health documents shown are made-up sample data. Three demo accounts were used: Priya Nair (owner of Luna), Rohan Mehta (owner of Cooper) and the Pawred Admin. Where two screens share one figure, the first is on top.</w:t>
+      </w:r>
+    </w:p>
+    <w:p>
+      <w:pPr/>
+      <w:r>
+        <w:rPr>
+          <w:b/>
+        </w:rPr>
+        <w:t xml:space="preserve">Public pages</w:t>
+      </w:r>
+    </w:p>
+    <w:p>
+      <w:pPr/>
+      <w:r>
+        <w:drawing>
+          <wp:inline distT="0" distB="0" distL="0" distR="0">
+            <wp:extent cx="5486400" cy="3429000"/>
+            <wp:docPr id="2" name="image2" descr="Fig. 4.1 — Landing page"/>
+            <a:graphic xmlns:a="http://schemas.openxmlformats.org/drawingml/2006/main">
+              <a:graphicData uri="http://schemas.openxmlformats.org/drawingml/2006/picture">
+                <pic:pic xmlns:pic="http://schemas.openxmlformats.org/drawingml/2006/picture">
+                  <pic:nvPicPr>
+                    <pic:cNvPr id="2" name="image2" descr="Fig. 4.1 — Landing page"/>
+                    <pic:cNvPicPr/>
+                  </pic:nvPicPr>
+                  <pic:blipFill>
+                    <a:blip r:embed="rId4"/>
+                    <a:stretch>
+                      <a:fillRect/>
+                    </a:stretch>
+                  </pic:blipFill>
+                  <pic:spPr>
+                    <a:xfrm>
+                      <a:off x="0" y="0"/>
+                      <a:ext cx="5486400" cy="3429000"/>
+                    </a:xfrm>
+                    <a:prstGeom prst="rect">
+                      <a:avLst/>
+                    </a:prstGeom>
+                  </pic:spPr>
+                </pic:pic>
+              </a:graphicData>
+            </a:graphic>
+          </wp:inline>
+        </w:drawing>
+      </w:r>
+    </w:p>
+    <w:p>
+      <w:pPr/>
+      <w:r>
+        <w:rPr>
+          <w:i/>
+        </w:rPr>
+        <w:t xml:space="preserve">Fig. 4.1 — Landing page with a sample profile visitors can like</w:t>
+      </w:r>
+    </w:p>
+    <w:p>
+      <w:pPr/>
+      <w:r>
+        <w:drawing>
+          <wp:inline distT="0" distB="0" distL="0" distR="0">
+            <wp:extent cx="5486400" cy="7285939"/>
+            <wp:docPr id="3" name="image3" descr="Fig. 4.2 — How it works"/>
+            <a:graphic xmlns:a="http://schemas.openxmlformats.org/drawingml/2006/main">
+              <a:graphicData uri="http://schemas.openxmlformats.org/drawingml/2006/picture">
+                <pic:pic xmlns:pic="http://schemas.openxmlformats.org/drawingml/2006/picture">
+                  <pic:nvPicPr>
+                    <pic:cNvPr id="3" name="image3" descr="Fig. 4.2 — How it works"/>
+                    <pic:cNvPicPr/>
+                  </pic:nvPicPr>
+                  <pic:blipFill>
+                    <a:blip r:embed="rId5"/>
+                    <a:stretch>
+                      <a:fillRect/>
+                    </a:stretch>
+                  </pic:blipFill>
+                  <pic:spPr>
+                    <a:xfrm>
+                      <a:off x="0" y="0"/>
+                      <a:ext cx="5486400" cy="7285939"/>
+                    </a:xfrm>
+                    <a:prstGeom prst="rect">
+                      <a:avLst/>
+                    </a:prstGeom>
+                  </pic:spPr>
+                </pic:pic>
+              </a:graphicData>
+            </a:graphic>
+          </wp:inline>
+        </w:drawing>
+      </w:r>
+    </w:p>
+    <w:p>
+      <w:pPr/>
+      <w:r>
+        <w:rPr>
+          <w:i/>
+        </w:rPr>
+        <w:t xml:space="preserve">Fig. 4.2 — How it works page</w:t>
+      </w:r>
+    </w:p>
+    <w:p>
+      <w:pPr/>
+      <w:r>
+        <w:drawing>
+          <wp:inline distT="0" distB="0" distL="0" distR="0">
+            <wp:extent cx="5486400" cy="6923836"/>
+            <wp:docPr id="4" name="image4" descr="Fig. 4.3 — Safety page and breed guide"/>
+            <a:graphic xmlns:a="http://schemas.openxmlformats.org/drawingml/2006/main">
+              <a:graphicData uri="http://schemas.openxmlformats.org/drawingml/2006/picture">
+                <pic:pic xmlns:pic="http://schemas.openxmlformats.org/drawingml/2006/picture">
+                  <pic:nvPicPr>
+                    <pic:cNvPr id="4" name="image4" descr="Fig. 4.3 — Safety page and breed guide"/>
+                    <pic:cNvPicPr/>
+                  </pic:nvPicPr>
+                  <pic:blipFill>
+                    <a:blip r:embed="rId6"/>
+                    <a:stretch>
+                      <a:fillRect/>
+                    </a:stretch>
+                  </pic:blipFill>
+                  <pic:spPr>
+                    <a:xfrm>
+                      <a:off x="0" y="0"/>
+                      <a:ext cx="5486400" cy="6923836"/>
+                    </a:xfrm>
+                    <a:prstGeom prst="rect">
+                      <a:avLst/>
+                    </a:prstGeom>
+                  </pic:spPr>
+                </pic:pic>
+              </a:graphicData>
+            </a:graphic>
+          </wp:inline>
+        </w:drawing>
+      </w:r>
+    </w:p>
+    <w:p>
+      <w:pPr/>
+      <w:r>
+        <w:rPr>
+          <w:i/>
+        </w:rPr>
+        <w:t xml:space="preserve">Fig. 4.3 — Safety page (top) and breed guide for Golden Retrievers (bottom)</w:t>
+      </w:r>
+    </w:p>
+    <w:p>
+      <w:pPr/>
+      <w:r>
+        <w:rPr>
+          <w:b/>
+        </w:rPr>
+        <w:t xml:space="preserve">Sign-up, sign-in and onboarding</w:t>
+      </w:r>
+    </w:p>
+    <w:p>
+      <w:pPr/>
+      <w:r>
+        <w:drawing>
+          <wp:inline distT="0" distB="0" distL="0" distR="0">
+            <wp:extent cx="5486400" cy="6923836"/>
+            <wp:docPr id="5" name="image5" descr="Fig. 4.4 — Sign-in and sign-up"/>
+            <a:graphic xmlns:a="http://schemas.openxmlformats.org/drawingml/2006/main">
+              <a:graphicData uri="http://schemas.openxmlformats.org/drawingml/2006/picture">
+                <pic:pic xmlns:pic="http://schemas.openxmlformats.org/drawingml/2006/picture">
+                  <pic:nvPicPr>
+                    <pic:cNvPr id="5" name="image5" descr="Fig. 4.4 — Sign-in and sign-up"/>
+                    <pic:cNvPicPr/>
+                  </pic:nvPicPr>
+                  <pic:blipFill>
+                    <a:blip r:embed="rId7"/>
+                    <a:stretch>
+                      <a:fillRect/>
+                    </a:stretch>
+                  </pic:blipFill>
+                  <pic:spPr>
+                    <a:xfrm>
+                      <a:off x="0" y="0"/>
+                      <a:ext cx="5486400" cy="6923836"/>
+                    </a:xfrm>
+                    <a:prstGeom prst="rect">
+                      <a:avLst/>
+                    </a:prstGeom>
+                  </pic:spPr>
+                </pic:pic>
+              </a:graphicData>
+            </a:graphic>
+          </wp:inline>
+        </w:drawing>
+      </w:r>
+    </w:p>
+    <w:p>
+      <w:pPr/>
+      <w:r>
+        <w:rPr>
+          <w:i/>
+        </w:rPr>
+        <w:t xml:space="preserve">Fig. 4.4 — Sign-in page with one-click demo accounts (top) and sign-up page (bottom)</w:t>
+      </w:r>
+    </w:p>
+    <w:p>
+      <w:pPr/>
+      <w:r>
+        <w:drawing>
+          <wp:inline distT="0" distB="0" distL="0" distR="0">
+            <wp:extent cx="5486400" cy="3429000"/>
+            <wp:docPr id="6" name="image6" descr="Fig. 4.5 — Onboarding"/>
+            <a:graphic xmlns:a="http://schemas.openxmlformats.org/drawingml/2006/main">
+              <a:graphicData uri="http://schemas.openxmlformats.org/drawingml/2006/picture">
+                <pic:pic xmlns:pic="http://schemas.openxmlformats.org/drawingml/2006/picture">
+                  <pic:nvPicPr>
+                    <pic:cNvPr id="6" name="image6" descr="Fig. 4.5 — Onboarding"/>
+                    <pic:cNvPicPr/>
+                  </pic:nvPicPr>
+                  <pic:blipFill>
+                    <a:blip r:embed="rId8"/>
+                    <a:stretch>
+                      <a:fillRect/>
+                    </a:stretch>
+                  </pic:blipFill>
+                  <pic:spPr>
+                    <a:xfrm>
+                      <a:off x="0" y="0"/>
+                      <a:ext cx="5486400" cy="3429000"/>
+                    </a:xfrm>
+                    <a:prstGeom prst="rect">
+                      <a:avLst/>
+                    </a:prstGeom>
+                  </pic:spPr>
+                </pic:pic>
+              </a:graphicData>
+            </a:graphic>
+          </wp:inline>
+        </w:drawing>
+      </w:r>
+    </w:p>
+    <w:p>
+      <w:pPr/>
+      <w:r>
+        <w:rPr>
+          <w:i/>
+        </w:rPr>
+        <w:t xml:space="preserve">Fig. 4.5 — Onboarding step 1 of 4: the basics (name, breed, sex, date of birth, city)</w:t>
+      </w:r>
+    </w:p>
+    <w:p>
+      <w:pPr/>
+      <w:r>
+        <w:rPr>
+          <w:b/>
+        </w:rPr>
+        <w:t xml:space="preserve">Discover</w:t>
+      </w:r>
+    </w:p>
+    <w:p>
+      <w:pPr/>
+      <w:r>
+        <w:drawing>
+          <wp:inline distT="0" distB="0" distL="0" distR="0">
+            <wp:extent cx="5486400" cy="3429000"/>
+            <wp:docPr id="7" name="image7" descr="Fig. 4.6 — Discover feed"/>
+            <a:graphic xmlns:a="http://schemas.openxmlformats.org/drawingml/2006/main">
+              <a:graphicData uri="http://schemas.openxmlformats.org/drawingml/2006/picture">
+                <pic:pic xmlns:pic="http://schemas.openxmlformats.org/drawingml/2006/picture">
+                  <pic:nvPicPr>
+                    <pic:cNvPr id="7" name="image7" descr="Fig. 4.6 — Discover feed"/>
+                    <pic:cNvPicPr/>
+                  </pic:nvPicPr>
+                  <pic:blipFill>
+                    <a:blip r:embed="rId9"/>
+                    <a:stretch>
+                      <a:fillRect/>
+                    </a:stretch>
+                  </pic:blipFill>
+                  <pic:spPr>
+                    <a:xfrm>
+                      <a:off x="0" y="0"/>
+                      <a:ext cx="5486400" cy="3429000"/>
+                    </a:xfrm>
+                    <a:prstGeom prst="rect">
+                      <a:avLst/>
+                    </a:prstGeom>
+                  </pic:spPr>
+                </pic:pic>
+              </a:graphicData>
+            </a:graphic>
+          </wp:inline>
+        </w:drawing>
+      </w:r>
+    </w:p>
+    <w:p>
+      <w:pPr/>
+      <w:r>
+        <w:rPr>
+          <w:i/>
+        </w:rPr>
+        <w:t xml:space="preserve">Fig. 4.6 — Discover, Feed view: dogs that suit Luna, with Verified-only and city filters</w:t>
+      </w:r>
+    </w:p>
+    <w:p>
+      <w:pPr/>
+      <w:r>
+        <w:drawing>
+          <wp:inline distT="0" distB="0" distL="0" distR="0">
+            <wp:extent cx="5486400" cy="3429000"/>
+            <wp:docPr id="8" name="image8" descr="Fig. 4.7 — Discover grid"/>
+            <a:graphic xmlns:a="http://schemas.openxmlformats.org/drawingml/2006/main">
+              <a:graphicData uri="http://schemas.openxmlformats.org/drawingml/2006/picture">
+                <pic:pic xmlns:pic="http://schemas.openxmlformats.org/drawingml/2006/picture">
+                  <pic:nvPicPr>
+                    <pic:cNvPr id="8" name="image8" descr="Fig. 4.7 — Discover grid"/>
+                    <pic:cNvPicPr/>
+                  </pic:nvPicPr>
+                  <pic:blipFill>
+                    <a:blip r:embed="rId10"/>
+                    <a:stretch>
+                      <a:fillRect/>
+                    </a:stretch>
+                  </pic:blipFill>
+                  <pic:spPr>
+                    <a:xfrm>
+                      <a:off x="0" y="0"/>
+                      <a:ext cx="5486400" cy="3429000"/>
+                    </a:xfrm>
+                    <a:prstGeom prst="rect">
+                      <a:avLst/>
+                    </a:prstGeom>
+                  </pic:spPr>
+                </pic:pic>
+              </a:graphicData>
+            </a:graphic>
+          </wp:inline>
+        </w:drawing>
+      </w:r>
+    </w:p>
+    <w:p>
+      <w:pPr/>
+      <w:r>
+        <w:rPr>
+          <w:i/>
+        </w:rPr>
+        <w:t xml:space="preserve">Fig. 4.7 — Discover, Grid view</w:t>
+      </w:r>
+    </w:p>
+    <w:p>
+      <w:pPr/>
+      <w:r>
+        <w:drawing>
+          <wp:inline distT="0" distB="0" distL="0" distR="0">
+            <wp:extent cx="3464752" cy="7498080"/>
+            <wp:docPr id="9" name="image9" descr="Fig. 4.8 — Discover on a phone"/>
+            <a:graphic xmlns:a="http://schemas.openxmlformats.org/drawingml/2006/main">
+              <a:graphicData uri="http://schemas.openxmlformats.org/drawingml/2006/picture">
+                <pic:pic xmlns:pic="http://schemas.openxmlformats.org/drawingml/2006/picture">
+                  <pic:nvPicPr>
+                    <pic:cNvPr id="9" name="image9" descr="Fig. 4.8 — Discover on a phone"/>
+                    <pic:cNvPicPr/>
+                  </pic:nvPicPr>
+                  <pic:blipFill>
+                    <a:blip r:embed="rId11"/>
+                    <a:stretch>
+                      <a:fillRect/>
+                    </a:stretch>
+                  </pic:blipFill>
+                  <pic:spPr>
+                    <a:xfrm>
+                      <a:off x="0" y="0"/>
+                      <a:ext cx="3464752" cy="7498080"/>
+                    </a:xfrm>
+                    <a:prstGeom prst="rect">
+                      <a:avLst/>
+                    </a:prstGeom>
+                  </pic:spPr>
+                </pic:pic>
+              </a:graphicData>
+            </a:graphic>
+          </wp:inline>
+        </w:drawing>
+      </w:r>
+    </w:p>
+    <w:p>
+      <w:pPr/>
+      <w:r>
+        <w:rPr>
+          <w:i/>
+        </w:rPr>
+        <w:t xml:space="preserve">Fig. 4.8 — Discover on a phone</w:t>
+      </w:r>
+    </w:p>
+    <w:p>
+      <w:pPr/>
+      <w:r>
+        <w:rPr>
+          <w:b/>
+        </w:rPr>
+        <w:t xml:space="preserve">Dog profile and settings</w:t>
+      </w:r>
+    </w:p>
+    <w:p>
+      <w:pPr/>
+      <w:r>
+        <w:drawing>
+          <wp:inline distT="0" distB="0" distL="0" distR="0">
+            <wp:extent cx="5486400" cy="6430060"/>
+            <wp:docPr id="10" name="image10" descr="Fig. 4.9 — Dog profile"/>
+            <a:graphic xmlns:a="http://schemas.openxmlformats.org/drawingml/2006/main">
+              <a:graphicData uri="http://schemas.openxmlformats.org/drawingml/2006/picture">
+                <pic:pic xmlns:pic="http://schemas.openxmlformats.org/drawingml/2006/picture">
+                  <pic:nvPicPr>
+                    <pic:cNvPr id="10" name="image10" descr="Fig. 4.9 — Dog profile"/>
+                    <pic:cNvPicPr/>
+                  </pic:nvPicPr>
+                  <pic:blipFill>
+                    <a:blip r:embed="rId12"/>
+                    <a:stretch>
+                      <a:fillRect/>
+                    </a:stretch>
+                  </pic:blipFill>
+                  <pic:spPr>
+                    <a:xfrm>
+                      <a:off x="0" y="0"/>
+                      <a:ext cx="5486400" cy="6430060"/>
+                    </a:xfrm>
+                    <a:prstGeom prst="rect">
+                      <a:avLst/>
+                    </a:prstGeom>
+                  </pic:spPr>
+                </pic:pic>
+              </a:graphicData>
+            </a:graphic>
+          </wp:inline>
+        </w:drawing>
+      </w:r>
+    </w:p>
+    <w:p>
+      <w:pPr/>
+      <w:r>
+        <w:rPr>
+          <w:i/>
+        </w:rPr>
+        <w:t xml:space="preserve">Fig. 4.9 — Dog profile page (Luna)</w:t>
+      </w:r>
+    </w:p>
+    <w:p>
+      <w:pPr/>
+      <w:r>
+        <w:drawing>
+          <wp:inline distT="0" distB="0" distL="0" distR="0">
+            <wp:extent cx="5486400" cy="6430060"/>
+            <wp:docPr id="11" name="image11" descr="Fig. 4.10 — Edit dog profile"/>
+            <a:graphic xmlns:a="http://schemas.openxmlformats.org/drawingml/2006/main">
+              <a:graphicData uri="http://schemas.openxmlformats.org/drawingml/2006/picture">
+                <pic:pic xmlns:pic="http://schemas.openxmlformats.org/drawingml/2006/picture">
+                  <pic:nvPicPr>
+                    <pic:cNvPr id="11" name="image11" descr="Fig. 4.10 — Edit dog profile"/>
+                    <pic:cNvPicPr/>
+                  </pic:nvPicPr>
+                  <pic:blipFill>
+                    <a:blip r:embed="rId13"/>
+                    <a:stretch>
+                      <a:fillRect/>
+                    </a:stretch>
+                  </pic:blipFill>
+                  <pic:spPr>
+                    <a:xfrm>
+                      <a:off x="0" y="0"/>
+                      <a:ext cx="5486400" cy="6430060"/>
+                    </a:xfrm>
+                    <a:prstGeom prst="rect">
+                      <a:avLst/>
+                    </a:prstGeom>
+                  </pic:spPr>
+                </pic:pic>
+              </a:graphicData>
+            </a:graphic>
+          </wp:inline>
+        </w:drawing>
+      </w:r>
+    </w:p>
+    <w:p>
+      <w:pPr/>
+      <w:r>
+        <w:rPr>
+          <w:i/>
+        </w:rPr>
+        <w:t xml:space="preserve">Fig. 4.10 — Edit profile: basics, photos, prompts, health and visibility</w:t>
+      </w:r>
+    </w:p>
+    <w:p>
+      <w:pPr/>
+      <w:r>
+        <w:drawing>
+          <wp:inline distT="0" distB="0" distL="0" distR="0">
+            <wp:extent cx="5486400" cy="3429000"/>
+            <wp:docPr id="12" name="image12" descr="Fig. 4.11 — Settings"/>
+            <a:graphic xmlns:a="http://schemas.openxmlformats.org/drawingml/2006/main">
+              <a:graphicData uri="http://schemas.openxmlformats.org/drawingml/2006/picture">
+                <pic:pic xmlns:pic="http://schemas.openxmlformats.org/drawingml/2006/picture">
+                  <pic:nvPicPr>
+                    <pic:cNvPr id="12" name="image12" descr="Fig. 4.11 — Settings"/>
+                    <pic:cNvPicPr/>
+                  </pic:nvPicPr>
+                  <pic:blipFill>
+                    <a:blip r:embed="rId14"/>
+                    <a:stretch>
+                      <a:fillRect/>
+                    </a:stretch>
+                  </pic:blipFill>
+                  <pic:spPr>
+                    <a:xfrm>
+                      <a:off x="0" y="0"/>
+                      <a:ext cx="5486400" cy="3429000"/>
+                    </a:xfrm>
+                    <a:prstGeom prst="rect">
+                      <a:avLst/>
+                    </a:prstGeom>
+                  </pic:spPr>
+                </pic:pic>
+              </a:graphicData>
+            </a:graphic>
+          </wp:inline>
+        </w:drawing>
+      </w:r>
+    </w:p>
+    <w:p>
+      <w:pPr/>
+      <w:r>
+        <w:rPr>
+          <w:i/>
+        </w:rPr>
+        <w:t xml:space="preserve">Fig. 4.11 — Settings: the owner's dogs and account</w:t>
+      </w:r>
+    </w:p>
+    <w:p>
+      <w:pPr/>
+      <w:r>
+        <w:rPr>
+          <w:b/>
+        </w:rPr>
+        <w:t xml:space="preserve">Likes, matches and chat</w:t>
+      </w:r>
+    </w:p>
+    <w:p>
+      <w:pPr/>
+      <w:r>
+        <w:drawing>
+          <wp:inline distT="0" distB="0" distL="0" distR="0">
+            <wp:extent cx="5486400" cy="6923836"/>
+            <wp:docPr id="13" name="image13" descr="Fig. 4.12 — Likes you and matches"/>
+            <a:graphic xmlns:a="http://schemas.openxmlformats.org/drawingml/2006/main">
+              <a:graphicData uri="http://schemas.openxmlformats.org/drawingml/2006/picture">
+                <pic:pic xmlns:pic="http://schemas.openxmlformats.org/drawingml/2006/picture">
+                  <pic:nvPicPr>
+                    <pic:cNvPr id="13" name="image13" descr="Fig. 4.12 — Likes you and matches"/>
+                    <pic:cNvPicPr/>
+                  </pic:nvPicPr>
+                  <pic:blipFill>
+                    <a:blip r:embed="rId15"/>
+                    <a:stretch>
+                      <a:fillRect/>
+                    </a:stretch>
+                  </pic:blipFill>
+                  <pic:spPr>
+                    <a:xfrm>
+                      <a:off x="0" y="0"/>
+                      <a:ext cx="5486400" cy="6923836"/>
+                    </a:xfrm>
+                    <a:prstGeom prst="rect">
+                      <a:avLst/>
+                    </a:prstGeom>
+                  </pic:spPr>
+                </pic:pic>
+              </a:graphicData>
+            </a:graphic>
+          </wp:inline>
+        </w:drawing>
+      </w:r>
+    </w:p>
+    <w:p>
+      <w:pPr/>
+      <w:r>
+        <w:rPr>
+          <w:i/>
+        </w:rPr>
+        <w:t xml:space="preserve">Fig. 4.12 — Likes you (top): Honey liked a prompt on Cooper's profile, and the owner can like back or decline; Matches list with unread badges (bottom)</w:t>
+      </w:r>
+    </w:p>
+    <w:p>
+      <w:pPr/>
+      <w:r>
+        <w:drawing>
+          <wp:inline distT="0" distB="0" distL="0" distR="0">
+            <wp:extent cx="5486400" cy="3429000"/>
+            <wp:docPr id="14" name="image14" descr="Fig. 4.13 — Chat"/>
+            <a:graphic xmlns:a="http://schemas.openxmlformats.org/drawingml/2006/main">
+              <a:graphicData uri="http://schemas.openxmlformats.org/drawingml/2006/picture">
+                <pic:pic xmlns:pic="http://schemas.openxmlformats.org/drawingml/2006/picture">
+                  <pic:nvPicPr>
+                    <pic:cNvPr id="14" name="image14" descr="Fig. 4.13 — Chat"/>
+                    <pic:cNvPicPr/>
+                  </pic:nvPicPr>
+                  <pic:blipFill>
+                    <a:blip r:embed="rId16"/>
+                    <a:stretch>
+                      <a:fillRect/>
+                    </a:stretch>
+                  </pic:blipFill>
+                  <pic:spPr>
+                    <a:xfrm>
+                      <a:off x="0" y="0"/>
+                      <a:ext cx="5486400" cy="3429000"/>
+                    </a:xfrm>
+                    <a:prstGeom prst="rect">
+                      <a:avLst/>
+                    </a:prstGeom>
+                  </pic:spPr>
+                </pic:pic>
+              </a:graphicData>
+            </a:graphic>
+          </wp:inline>
+        </w:drawing>
+      </w:r>
+    </w:p>
+    <w:p>
+      <w:pPr/>
+      <w:r>
+        <w:rPr>
+          <w:i/>
+        </w:rPr>
+        <w:t xml:space="preserve">Fig. 4.13 — Chat between matched owners, with read receipts</w:t>
+      </w:r>
+    </w:p>
+    <w:p>
+      <w:pPr/>
+      <w:r>
+        <w:rPr>
+          <w:b/>
+        </w:rPr>
+        <w:t xml:space="preserve">Admin panel</w:t>
+      </w:r>
+    </w:p>
+    <w:p>
+      <w:pPr/>
+      <w:r>
+        <w:drawing>
+          <wp:inline distT="0" distB="0" distL="0" distR="0">
+            <wp:extent cx="5486400" cy="6430060"/>
+            <wp:docPr id="15" name="image15" descr="Fig. 4.14 — Admin overview"/>
+            <a:graphic xmlns:a="http://schemas.openxmlformats.org/drawingml/2006/main">
+              <a:graphicData uri="http://schemas.openxmlformats.org/drawingml/2006/picture">
+                <pic:pic xmlns:pic="http://schemas.openxmlformats.org/drawingml/2006/picture">
+                  <pic:nvPicPr>
+                    <pic:cNvPr id="15" name="image15" descr="Fig. 4.14 — Admin overview"/>
+                    <pic:cNvPicPr/>
+                  </pic:nvPicPr>
+                  <pic:blipFill>
+                    <a:blip r:embed="rId17"/>
+                    <a:stretch>
+                      <a:fillRect/>
+                    </a:stretch>
+                  </pic:blipFill>
+                  <pic:spPr>
+                    <a:xfrm>
+                      <a:off x="0" y="0"/>
+                      <a:ext cx="5486400" cy="6430060"/>
+                    </a:xfrm>
+                    <a:prstGeom prst="rect">
+                      <a:avLst/>
+                    </a:prstGeom>
+                  </pic:spPr>
+                </pic:pic>
+              </a:graphicData>
+            </a:graphic>
+          </wp:inline>
+        </w:drawing>
+      </w:r>
+    </w:p>
+    <w:p>
+      <w:pPr/>
+      <w:r>
+        <w:rPr>
+          <w:i/>
+        </w:rPr>
+        <w:t xml:space="preserve">Fig. 4.14 — Admin overview: totals and recent activity</w:t>
+      </w:r>
+    </w:p>
+    <w:p>
+      <w:pPr/>
+      <w:r>
+        <w:drawing>
+          <wp:inline distT="0" distB="0" distL="0" distR="0">
+            <wp:extent cx="5486400" cy="3429000"/>
+            <wp:docPr id="16" name="image16" descr="Fig. 4.15 — Admin verifications"/>
+            <a:graphic xmlns:a="http://schemas.openxmlformats.org/drawingml/2006/main">
+              <a:graphicData uri="http://schemas.openxmlformats.org/drawingml/2006/picture">
+                <pic:pic xmlns:pic="http://schemas.openxmlformats.org/drawingml/2006/picture">
+                  <pic:nvPicPr>
+                    <pic:cNvPr id="16" name="image16" descr="Fig. 4.15 — Admin verifications"/>
+                    <pic:cNvPicPr/>
+                  </pic:nvPicPr>
+                  <pic:blipFill>
+                    <a:blip r:embed="rId18"/>
+                    <a:stretch>
+                      <a:fillRect/>
+                    </a:stretch>
+                  </pic:blipFill>
+                  <pic:spPr>
+                    <a:xfrm>
+                      <a:off x="0" y="0"/>
+                      <a:ext cx="5486400" cy="3429000"/>
+                    </a:xfrm>
+                    <a:prstGeom prst="rect">
+                      <a:avLst/>
+                    </a:prstGeom>
+                  </pic:spPr>
+                </pic:pic>
+              </a:graphicData>
+            </a:graphic>
+          </wp:inline>
+        </w:drawing>
+      </w:r>
+    </w:p>
+    <w:p>
+      <w:pPr/>
+      <w:r>
+        <w:rPr>
+          <w:i/>
+        </w:rPr>
+        <w:t xml:space="preserve">Fig. 4.15 — Admin verifications: approve or reject health documents</w:t>
+      </w:r>
+    </w:p>
+    <w:p>
+      <w:pPr/>
+      <w:r>
+        <w:drawing>
+          <wp:inline distT="0" distB="0" distL="0" distR="0">
+            <wp:extent cx="5486400" cy="6923836"/>
+            <wp:docPr id="17" name="image17" descr="Fig. 4.16 — Admin reports and users"/>
+            <a:graphic xmlns:a="http://schemas.openxmlformats.org/drawingml/2006/main">
+              <a:graphicData uri="http://schemas.openxmlformats.org/drawingml/2006/picture">
+                <pic:pic xmlns:pic="http://schemas.openxmlformats.org/drawingml/2006/picture">
+                  <pic:nvPicPr>
+                    <pic:cNvPr id="17" name="image17" descr="Fig. 4.16 — Admin reports and users"/>
+                    <pic:cNvPicPr/>
+                  </pic:nvPicPr>
+                  <pic:blipFill>
+                    <a:blip r:embed="rId19"/>
+                    <a:stretch>
+                      <a:fillRect/>
+                    </a:stretch>
+                  </pic:blipFill>
+                  <pic:spPr>
+                    <a:xfrm>
+                      <a:off x="0" y="0"/>
+                      <a:ext cx="5486400" cy="6923836"/>
+                    </a:xfrm>
+                    <a:prstGeom prst="rect">
+                      <a:avLst/>
+                    </a:prstGeom>
+                  </pic:spPr>
+                </pic:pic>
+              </a:graphicData>
+            </a:graphic>
+          </wp:inline>
+        </w:drawing>
+      </w:r>
+    </w:p>
+    <w:p>
+      <w:pPr/>
+      <w:r>
+        <w:rPr>
+          <w:i/>
+        </w:rPr>
+        <w:t xml:space="preserve">Fig. 4.16 — Admin reports (top) and users (bottom)</w:t>
       </w:r>
     </w:p>
     <w:p>
@@ -4292,7 +5847,7 @@
       <w:r>
         <w:t xml:space="preserve">Next.js Documentation, Vercel. </w:t>
       </w:r>
-      <w:hyperlink r:id="rId4" w:history="1">
+      <w:hyperlink r:id="rId20" w:history="1">
         <w:r>
           <w:rPr>
             <w:rStyle w:val="Hyperlink"/>
@@ -4312,7 +5867,7 @@
       <w:r>
         <w:t xml:space="preserve">Prisma ORM Documentation. </w:t>
       </w:r>
-      <w:hyperlink r:id="rId5" w:history="1">
+      <w:hyperlink r:id="rId21" w:history="1">
         <w:r>
           <w:rPr>
             <w:rStyle w:val="Hyperlink"/>
@@ -4332,7 +5887,7 @@
       <w:r>
         <w:t xml:space="preserve">Supabase Documentation. </w:t>
       </w:r>
-      <w:hyperlink r:id="rId6" w:history="1">
+      <w:hyperlink r:id="rId22" w:history="1">
         <w:r>
           <w:rPr>
             <w:rStyle w:val="Hyperlink"/>
@@ -4352,7 +5907,7 @@
       <w:r>
         <w:t xml:space="preserve">Better Auth Documentation. </w:t>
       </w:r>
-      <w:hyperlink r:id="rId7" w:history="1">
+      <w:hyperlink r:id="rId23" w:history="1">
         <w:r>
           <w:rPr>
             <w:rStyle w:val="Hyperlink"/>
@@ -4372,7 +5927,7 @@
       <w:r>
         <w:t xml:space="preserve">Web Content Accessibility Guidelines (WCAG) 2.2, W3C. </w:t>
       </w:r>
-      <w:hyperlink r:id="rId8" w:history="1">
+      <w:hyperlink r:id="rId24" w:history="1">
         <w:r>
           <w:rPr>
             <w:rStyle w:val="Hyperlink"/>

</xml_diff>